<commit_message>
fixing spike gate width and removing moffat stars
</commit_message>
<xml_diff>
--- a/Foreground Masking/documentation/Spike Gate Samples Explained.docx
+++ b/Foreground Masking/documentation/Spike Gate Samples Explained.docx
@@ -86,6 +86,12 @@
       <w:pPr/>
       <w:r>
         <w:t>Foreground stars and compact artefacts often appear as narrow positive spikes when the galaxy image is sampled along the bar major axis. Real galaxy structure can also be bright, but it usually changes more gradually. The spike gate tries to separate those cases before deciding which residual-image segments should be used as a foreground mask.</w:t>
+      </w:r>
+    </w:p>
+    <w:p>
+      <w:pPr/>
+      <w:r>
+        <w:t>The two-dimensional candidate segments are detected on a residual image, not directly on the raw science image. The pipeline first builds a broad Gaussian-smoothed galaxy model, then subtracts it from the science image: residual = science image - Gaussian-smoothed galaxy model. Photutils is run on this residual image so compact positive excesses stand out against the smooth galaxy background.</w:t>
       </w:r>
     </w:p>
     <w:p>
@@ -2388,7 +2394,7 @@
               <w:rPr>
                 <w:sz w:val="19"/>
               </w:rPr>
-              <w:t>samples 8 to 13</w:t>
+              <w:t>samples 8 to 12</w:t>
             </w:r>
           </w:p>
         </w:tc>
@@ -2486,6 +2492,90 @@
                 <w:sz w:val="19"/>
               </w:rPr>
               <w:t>Auto-tune treats the spike samples as fully covered.</w:t>
+            </w:r>
+          </w:p>
+        </w:tc>
+      </w:tr>
+    </w:tbl>
+    <w:p/>
+    <w:p>
+      <w:pPr>
+        <w:pStyle w:val="Heading1"/>
+      </w:pPr>
+      <w:r>
+        <w:t>What nsigma means in the Photutils step</w:t>
+      </w:r>
+    </w:p>
+    <w:p>
+      <w:pPr/>
+      <w:r>
+        <w:t>The nsigma value controls how high a residual-image pixel must be before it can seed a compact-source segment. The code estimates the residual background level from the finite pixels, computes a robust scatter using the median absolute deviation, and sets the detection threshold as:</w:t>
+      </w:r>
+    </w:p>
+    <w:p>
+      <w:pPr/>
+      <w:r>
+        <w:t>threshold = median(residual image) + nsigma x robust_sigma(residual image).</w:t>
+      </w:r>
+    </w:p>
+    <w:p>
+      <w:pPr/>
+      <w:r>
+        <w:t>The residual image is then passed to Photutils segmentation. In current Photutils versions this uses photutils.segmentation.detect_sources with 8-connectivity and the configured npixels value. npixels is the minimum connected area above threshold required for a detection. If deblending is enabled, the code then calls photutils.segmentation.deblend_sources to split blended detections into separate segments where possible.</w:t>
+      </w:r>
+    </w:p>
+    <w:tbl>
+      <w:tblPr>
+        <w:tblStyle w:val="TableGrid"/>
+        <w:tblW w:type="dxa" w:w="9360"/>
+        <w:tblLook w:firstColumn="1" w:firstRow="1" w:lastColumn="0" w:lastRow="0" w:noHBand="0" w:noVBand="1" w:val="04A0"/>
+        <w:tblBorders>
+          <w:top w:val="single" w:sz="4" w:space="0" w:color="CAD3DF"/>
+          <w:left w:val="single" w:sz="4" w:space="0" w:color="CAD3DF"/>
+          <w:bottom w:val="single" w:sz="4" w:space="0" w:color="CAD3DF"/>
+          <w:right w:val="single" w:sz="4" w:space="0" w:color="CAD3DF"/>
+          <w:insideH w:val="single" w:sz="4" w:space="0" w:color="CAD3DF"/>
+          <w:insideV w:val="single" w:sz="4" w:space="0" w:color="CAD3DF"/>
+        </w:tblBorders>
+        <w:tblInd w:w="120" w:type="dxa"/>
+        <w:tblLayout w:type="fixed"/>
+      </w:tblPr>
+      <w:tblGrid>
+        <w:gridCol w:w="9360"/>
+      </w:tblGrid>
+      <w:tr>
+        <w:trPr>
+          <w:cantSplit/>
+        </w:trPr>
+        <w:tc>
+          <w:tcPr>
+            <w:tcW w:type="dxa" w:w="9360"/>
+            <w:tcMar>
+              <w:top w:w="80" w:type="dxa"/>
+              <w:start w:w="120" w:type="dxa"/>
+              <w:bottom w:w="80" w:type="dxa"/>
+              <w:end w:w="120" w:type="dxa"/>
+            </w:tcMar>
+            <w:vAlign w:val="center"/>
+            <w:shd w:fill="F2F4F7"/>
+          </w:tcPr>
+          <w:p>
+            <w:pPr>
+              <w:spacing w:after="0" w:line="276" w:lineRule="auto"/>
+            </w:pPr>
+            <w:r>
+              <w:rPr>
+                <w:b/>
+                <w:color w:val="1F4D78"/>
+                <w:sz w:val="21"/>
+              </w:rPr>
+              <w:t>Interpretation:</w:t>
+            </w:r>
+            <w:r>
+              <w:rPr>
+                <w:sz w:val="21"/>
+              </w:rPr>
+              <w:t xml:space="preserve"> higher nsigma is more conservative and finds only brighter residual excesses; lower nsigma is more aggressive and can recover fainter contaminants, but it also increases the risk of detecting galaxy structure or noise residuals.</w:t>
             </w:r>
           </w:p>
         </w:tc>

</xml_diff>